<commit_message>
tmp too big :(
</commit_message>
<xml_diff>
--- a/output/LawanKZ_итоговый_отчёт.docx
+++ b/output/LawanKZ_итоговый_отчёт.docx
@@ -89,6 +89,32 @@
           <w:lang w:val="ru-RU"/>
         </w:rPr>
       </w:pPr>
+      <w:hyperlink r:id="rId8" w:history="1">
+        <w:r>
+          <w:rPr>
+            <w:rStyle w:val="Hyperlink"/>
+            <w:sz w:val="28"/>
+            <w:lang w:val="ru-RU"/>
+          </w:rPr>
+          <w:t>https://github.com/Felonal</w:t>
+        </w:r>
+        <w:r>
+          <w:rPr>
+            <w:rStyle w:val="Hyperlink"/>
+            <w:sz w:val="28"/>
+            <w:lang w:val="ru-RU"/>
+          </w:rPr>
+          <w:t>e</w:t>
+        </w:r>
+        <w:r>
+          <w:rPr>
+            <w:rStyle w:val="Hyperlink"/>
+            <w:sz w:val="28"/>
+            <w:lang w:val="ru-RU"/>
+          </w:rPr>
+          <w:t>/LawanKZ</w:t>
+        </w:r>
+      </w:hyperlink>
     </w:p>
     <w:p>
       <w:pPr>
@@ -2293,7 +2319,7 @@
                     <pic:cNvPicPr/>
                   </pic:nvPicPr>
                   <pic:blipFill>
-                    <a:blip r:embed="rId8"/>
+                    <a:blip r:embed="rId9"/>
                     <a:stretch>
                       <a:fillRect/>
                     </a:stretch>
@@ -4395,7 +4421,7 @@
                     <pic:cNvPicPr/>
                   </pic:nvPicPr>
                   <pic:blipFill>
-                    <a:blip r:embed="rId9"/>
+                    <a:blip r:embed="rId10"/>
                     <a:stretch>
                       <a:fillRect/>
                     </a:stretch>
@@ -4850,7 +4876,7 @@
                     <pic:cNvPicPr/>
                   </pic:nvPicPr>
                   <pic:blipFill>
-                    <a:blip r:embed="rId10"/>
+                    <a:blip r:embed="rId11"/>
                     <a:stretch>
                       <a:fillRect/>
                     </a:stretch>
@@ -7933,7 +7959,7 @@
                     <pic:cNvPicPr/>
                   </pic:nvPicPr>
                   <pic:blipFill>
-                    <a:blip r:embed="rId11"/>
+                    <a:blip r:embed="rId12"/>
                     <a:stretch>
                       <a:fillRect/>
                     </a:stretch>
@@ -10144,7 +10170,7 @@
       <w:r>
         <w:t xml:space="preserve">1. Mikolov T., Chen K., Corrado G., Dean J. Efficient Estimation of Word Representations in Vector Space. 2013. </w:t>
       </w:r>
-      <w:hyperlink r:id="rId12">
+      <w:hyperlink r:id="rId13">
         <w:r>
           <w:rPr>
             <w:color w:val="0563C1"/>
@@ -10170,7 +10196,7 @@
       <w:r>
         <w:t xml:space="preserve">: Global Vectors for Word Representation. EMNLP. 2014. P. 1532–1543. DOI 10.3115/v1/D14-1162. </w:t>
       </w:r>
-      <w:hyperlink r:id="rId13">
+      <w:hyperlink r:id="rId14">
         <w:r>
           <w:rPr>
             <w:color w:val="0563C1"/>
@@ -10212,7 +10238,7 @@
       <w:r>
         <w:t xml:space="preserve"> Information. TACL. 2017. Vol. 5. P. 135–146. DOI 10.1162/tacl_a_00051. </w:t>
       </w:r>
-      <w:hyperlink r:id="rId14">
+      <w:hyperlink r:id="rId15">
         <w:r>
           <w:rPr>
             <w:color w:val="0563C1"/>
@@ -10230,7 +10256,7 @@
       <w:r>
         <w:t xml:space="preserve">4. Salton G., Buckley C. Term-weighting approaches in automatic text retrieval. Information Processing and Management. 1988. Vol. 24. No. 5. P. 513–523. </w:t>
       </w:r>
-      <w:hyperlink r:id="rId15">
+      <w:hyperlink r:id="rId16">
         <w:r>
           <w:rPr>
             <w:color w:val="0563C1"/>
@@ -10272,7 +10298,7 @@
       <w:r>
         <w:t xml:space="preserve"> Industrial-strength Natural Language Processing in Python. 2020. </w:t>
       </w:r>
-      <w:hyperlink r:id="rId16">
+      <w:hyperlink r:id="rId17">
         <w:r>
           <w:rPr>
             <w:color w:val="0563C1"/>
@@ -10290,7 +10316,7 @@
       <w:r>
         <w:t xml:space="preserve">6. Bird S., Klein E., Loper E. Natural Language Processing with Python. O’Reilly Media, 2009. </w:t>
       </w:r>
-      <w:hyperlink r:id="rId17">
+      <w:hyperlink r:id="rId18">
         <w:r>
           <w:rPr>
             <w:color w:val="0563C1"/>
@@ -10316,7 +10342,7 @@
       <w:r>
         <w:t xml:space="preserve"> R., Sojka P. Software Framework for Topic Modelling with Large Corpora. LREC Workshop. 2010. P. 45–50. </w:t>
       </w:r>
-      <w:hyperlink r:id="rId18">
+      <w:hyperlink r:id="rId19">
         <w:r>
           <w:rPr>
             <w:color w:val="0563C1"/>
@@ -10334,7 +10360,7 @@
       <w:r>
         <w:t xml:space="preserve">8. Pedregosa F. et al. Scikit-learn: Machine Learning in Python. Journal of Machine Learning Research. 2011. Vol. 12. P. 2825–2830. </w:t>
       </w:r>
-      <w:hyperlink r:id="rId19">
+      <w:hyperlink r:id="rId20">
         <w:r>
           <w:rPr>
             <w:color w:val="0563C1"/>
@@ -10388,7 +10414,7 @@
         </w:rPr>
         <w:t xml:space="preserve">. 374. </w:t>
       </w:r>
-      <w:hyperlink r:id="rId20">
+      <w:hyperlink r:id="rId21">
         <w:r>
           <w:rPr>
             <w:color w:val="0563C1"/>
@@ -10497,7 +10523,7 @@
         </w:rPr>
         <w:t xml:space="preserve">. </w:t>
       </w:r>
-      <w:hyperlink r:id="rId21">
+      <w:hyperlink r:id="rId22">
         <w:r>
           <w:rPr>
             <w:color w:val="0563C1"/>
@@ -10670,7 +10696,7 @@
         </w:rPr>
         <w:t xml:space="preserve">. </w:t>
       </w:r>
-      <w:hyperlink r:id="rId22">
+      <w:hyperlink r:id="rId23">
         <w:r>
           <w:rPr>
             <w:color w:val="0563C1"/>
@@ -10829,7 +10855,7 @@
         </w:rPr>
         <w:t xml:space="preserve">. </w:t>
       </w:r>
-      <w:hyperlink r:id="rId23">
+      <w:hyperlink r:id="rId24">
         <w:r>
           <w:rPr>
             <w:color w:val="0563C1"/>
@@ -11002,7 +11028,7 @@
         </w:rPr>
         <w:t xml:space="preserve">. </w:t>
       </w:r>
-      <w:hyperlink r:id="rId24">
+      <w:hyperlink r:id="rId25">
         <w:r>
           <w:rPr>
             <w:color w:val="0563C1"/>
@@ -11175,7 +11201,7 @@
         </w:rPr>
         <w:t xml:space="preserve">. </w:t>
       </w:r>
-      <w:hyperlink r:id="rId25">
+      <w:hyperlink r:id="rId26">
         <w:r>
           <w:rPr>
             <w:color w:val="0563C1"/>
@@ -11348,7 +11374,7 @@
         </w:rPr>
         <w:t xml:space="preserve">. </w:t>
       </w:r>
-      <w:hyperlink r:id="rId26">
+      <w:hyperlink r:id="rId27">
         <w:r>
           <w:rPr>
             <w:color w:val="0563C1"/>
@@ -12486,8 +12512,8 @@
       </w:r>
     </w:p>
     <w:sectPr>
-      <w:headerReference w:type="default" r:id="rId27"/>
-      <w:footerReference w:type="default" r:id="rId28"/>
+      <w:headerReference w:type="default" r:id="rId28"/>
+      <w:footerReference w:type="default" r:id="rId29"/>
       <w:pgSz w:w="11906" w:h="16838"/>
       <w:pgMar w:top="1134" w:right="1020" w:bottom="1134" w:left="1417" w:header="720" w:footer="720" w:gutter="0"/>
       <w:cols w:space="720"/>
@@ -24565,6 +24591,30 @@
       <w:u w:val="single"/>
     </w:rPr>
   </w:style>
+  <w:style w:type="character" w:styleId="UnresolvedMention">
+    <w:name w:val="Unresolved Mention"/>
+    <w:basedOn w:val="DefaultParagraphFont"/>
+    <w:uiPriority w:val="99"/>
+    <w:semiHidden/>
+    <w:unhideWhenUsed/>
+    <w:rsid w:val="00E1477A"/>
+    <w:rPr>
+      <w:color w:val="605E5C"/>
+      <w:shd w:val="clear" w:color="auto" w:fill="E1DFDD"/>
+    </w:rPr>
+  </w:style>
+  <w:style w:type="character" w:styleId="FollowedHyperlink">
+    <w:name w:val="FollowedHyperlink"/>
+    <w:basedOn w:val="DefaultParagraphFont"/>
+    <w:uiPriority w:val="99"/>
+    <w:semiHidden/>
+    <w:unhideWhenUsed/>
+    <w:rsid w:val="00E1477A"/>
+    <w:rPr>
+      <w:color w:val="800080" w:themeColor="followedHyperlink"/>
+      <w:u w:val="single"/>
+    </w:rPr>
+  </w:style>
 </w:styles>
 </file>
 

</xml_diff>